<commit_message>
Updated: Directional sentiment score
</commit_message>
<xml_diff>
--- a/Prompts/cleaning_prompt.docx
+++ b/Prompts/cleaning_prompt.docx
@@ -480,7 +480,15 @@
         <w:t>:</w:t>
       </w:r>
       <w:r>
-        <w:t xml:space="preserve"> dayfirst=True</w:t>
+        <w:t xml:space="preserve"> </w:t>
+      </w:r>
+      <w:proofErr w:type="spellStart"/>
+      <w:r>
+        <w:t>dayfirst</w:t>
+      </w:r>
+      <w:proofErr w:type="spellEnd"/>
+      <w:r>
+        <w:t>=True</w:t>
       </w:r>
       <w:r>
         <w:t xml:space="preserve"> and errors=</w:t>
@@ -570,6 +578,7 @@
       <w:r>
         <w:t xml:space="preserve">Remove rows where either the summary or headline contains the </w:t>
       </w:r>
+      <w:proofErr w:type="gramStart"/>
       <w:r>
         <w:rPr>
           <w:rFonts w:ascii="Times New Roman" w:hAnsi="Times New Roman" w:cs="Times New Roman"/>
@@ -590,8 +599,9 @@
           <w:sz w:val="24"/>
           <w:szCs w:val="24"/>
         </w:rPr>
-        <w:t>'#NAME?'</w:t>
-      </w:r>
+        <w:t>'#</w:t>
+      </w:r>
+      <w:proofErr w:type="gramEnd"/>
       <w:r>
         <w:rPr>
           <w:rStyle w:val="HTMLCode"/>
@@ -600,6 +610,16 @@
           <w:sz w:val="24"/>
           <w:szCs w:val="24"/>
         </w:rPr>
+        <w:t>NAME?'</w:t>
+      </w:r>
+      <w:r>
+        <w:rPr>
+          <w:rStyle w:val="HTMLCode"/>
+          <w:rFonts w:ascii="Times New Roman" w:eastAsiaTheme="majorEastAsia" w:hAnsi="Times New Roman" w:cs="Times New Roman"/>
+          <w:color w:val="000000"/>
+          <w:sz w:val="24"/>
+          <w:szCs w:val="24"/>
+        </w:rPr>
         <w:t>.</w:t>
       </w:r>
     </w:p>
@@ -813,13 +833,7 @@
         </w:numPr>
       </w:pPr>
       <w:r>
-        <w:t>Remain only one</w:t>
-      </w:r>
-      <w:r>
-        <w:t xml:space="preserve"> to ensure uniqueness of news records</w:t>
-      </w:r>
-      <w:r>
-        <w:t>.</w:t>
+        <w:t>Remain only one to ensure uniqueness of news records.</w:t>
       </w:r>
     </w:p>
     <w:p>
@@ -892,11 +906,24 @@
         <w:t>"</w:t>
       </w:r>
       <w:r>
-        <w:t>{stock_name}</w:t>
+        <w:t>{</w:t>
+      </w:r>
+      <w:proofErr w:type="spellStart"/>
+      <w:r>
+        <w:t>stock_</w:t>
+      </w:r>
+      <w:proofErr w:type="gramStart"/>
+      <w:r>
+        <w:t>name</w:t>
+      </w:r>
+      <w:proofErr w:type="spellEnd"/>
+      <w:r>
+        <w:t>}</w:t>
       </w:r>
       <w:r>
         <w:t>_cleaned.csv</w:t>
       </w:r>
+      <w:proofErr w:type="gramEnd"/>
       <w:r>
         <w:rPr>
           <w:rFonts w:ascii="-webkit-standard" w:hAnsi="-webkit-standard"/>

</xml_diff>